<commit_message>
updated instructions for s3 hosting lab
</commit_message>
<xml_diff>
--- a/04_distrib_data_storage_foundations/lab_amazon_s3/lab_instructions_amazon_s3.docx
+++ b/04_distrib_data_storage_foundations/lab_amazon_s3/lab_instructions_amazon_s3.docx
@@ -11,31 +11,25 @@
         <w:rPr/>
         <w:t>University of Virginia Data Science</w:t>
         <w:br/>
-        <w:t xml:space="preserve">DS </w:t>
-      </w:r>
-      <w:r>
-        <w:rPr/>
-        <w:t>5110 Big Data Systems</w:t>
-      </w:r>
-      <w:r>
-        <w:rPr/>
+        <w:t>DS 5110 Big Data Systems</w:t>
         <w:br/>
         <w:t xml:space="preserve">Last updated: </w:t>
       </w:r>
       <w:r>
         <w:rPr/>
-        <w:t>February 25</w:t>
-      </w:r>
-      <w:r>
-        <w:rPr/>
-        <w:t>, 202</w:t>
-      </w:r>
-      <w:r>
-        <w:rPr/>
-        <w:t>6</w:t>
-      </w:r>
-      <w:r>
-        <w:rPr/>
+        <w:t>June</w:t>
+      </w:r>
+      <w:r>
+        <w:rPr/>
+        <w:t xml:space="preserve"> </w:t>
+      </w:r>
+      <w:r>
+        <w:rPr/>
+        <w:t>18</w:t>
+      </w:r>
+      <w:r>
+        <w:rPr/>
+        <w:t>, 2026</w:t>
         <w:br/>
         <w:br/>
         <w:t xml:space="preserve">Assignment: Hosting a Static Website on Amazon S3 </w:t>
@@ -79,9 +73,27 @@
       </w:pPr>
       <w:r>
         <w:rPr/>
+      </w:r>
+    </w:p>
+    <w:p>
+      <w:pPr>
+        <w:pStyle w:val="Normal"/>
+        <w:rPr/>
+      </w:pPr>
+      <w:r>
+        <w:rPr/>
         <w:t xml:space="preserve">2) (2 PTS) Configure your bucket to enable website hosting. Include a screenshot that shows: </w:t>
         <w:br/>
         <w:t>Static website hosting is Enabled.</w:t>
+      </w:r>
+    </w:p>
+    <w:p>
+      <w:pPr>
+        <w:pStyle w:val="Normal"/>
+        <w:rPr/>
+      </w:pPr>
+      <w:r>
+        <w:rPr/>
       </w:r>
     </w:p>
     <w:p>
@@ -125,17 +137,39 @@
         <w:t>.</w:t>
         <w:br/>
         <w:t>Include a screenshot that shows the two files in your S3 bucket.</w:t>
-        <w:br/>
-      </w:r>
-    </w:p>
-    <w:p>
-      <w:pPr>
-        <w:pStyle w:val="Normal"/>
-        <w:rPr/>
-      </w:pPr>
-      <w:r>
-        <w:rPr/>
-        <w:t>4) (1 PT) Set public access permissions on your bucket. Include a screenshot that shows your bucket name, with the text “Publicly accessible.”</w:t>
+      </w:r>
+    </w:p>
+    <w:p>
+      <w:pPr>
+        <w:pStyle w:val="Normal"/>
+        <w:rPr/>
+      </w:pPr>
+      <w:r>
+        <w:rPr/>
+        <w:br/>
+      </w:r>
+    </w:p>
+    <w:p>
+      <w:pPr>
+        <w:pStyle w:val="Normal"/>
+        <w:rPr/>
+      </w:pPr>
+      <w:r>
+        <w:rPr/>
+        <w:t xml:space="preserve">4) (1 PT) Set public access permissions on your bucket. Include a screenshot that shows your bucket name with </w:t>
+      </w:r>
+      <w:r>
+        <w:rPr/>
+        <w:t>the blocking of all public access turned off.</w:t>
+      </w:r>
+    </w:p>
+    <w:p>
+      <w:pPr>
+        <w:pStyle w:val="Normal"/>
+        <w:rPr/>
+      </w:pPr>
+      <w:r>
+        <w:rPr/>
       </w:r>
     </w:p>
     <w:p>
@@ -155,6 +189,15 @@
       <w:r>
         <w:rPr/>
         <w:t>5) (1 PT) Add a bucket policy, which should include your ARN. Include a screenshot from the Permissions tab that shows the Bucket Policy.</w:t>
+      </w:r>
+    </w:p>
+    <w:p>
+      <w:pPr>
+        <w:pStyle w:val="Normal"/>
+        <w:rPr/>
+      </w:pPr>
+      <w:r>
+        <w:rPr/>
       </w:r>
     </w:p>
     <w:p>

</xml_diff>